<commit_message>
bai tap 1 tuan 03
</commit_message>
<xml_diff>
--- a/Lab3/MinhChungLab03.docx
+++ b/Lab3/MinhChungLab03.docx
@@ -21,9 +21,64 @@
       <w:r>
         <w:t>3 Pattern</w:t>
       </w:r>
+    </w:p>
+    <w:p>
+      <w:r>
+        <w:t>Mô tả bài 1: Hệ thống quản lí đơn hàng có trạng thái như: Mới tạo, Đang xử lí, Đã giao và Đã hủy</w:t>
+      </w:r>
       <w:bookmarkStart w:id="0" w:name="_GoBack"/>
       <w:bookmarkEnd w:id="0"/>
     </w:p>
+    <w:p/>
+    <w:p>
+      <w:r>
+        <w:rPr>
+          <w:noProof/>
+        </w:rPr>
+        <w:drawing>
+          <wp:inline distT="0" distB="0" distL="0" distR="0">
+            <wp:extent cx="6675862" cy="1933575"/>
+            <wp:effectExtent l="0" t="0" r="0" b="0"/>
+            <wp:docPr id="1" name="Picture 1"/>
+            <wp:cNvGraphicFramePr>
+              <a:graphicFrameLocks xmlns:a="http://schemas.openxmlformats.org/drawingml/2006/main" noChangeAspect="1"/>
+            </wp:cNvGraphicFramePr>
+            <a:graphic xmlns:a="http://schemas.openxmlformats.org/drawingml/2006/main">
+              <a:graphicData uri="http://schemas.openxmlformats.org/drawingml/2006/picture">
+                <pic:pic xmlns:pic="http://schemas.openxmlformats.org/drawingml/2006/picture">
+                  <pic:nvPicPr>
+                    <pic:cNvPr id="1" name="ZLJ1RXCn4BtxAqQzaAhQVa15KKCImG6QakI2nCKuarsh6-_Mwss3e6VEFNA2Y7D_e16d8FvZ_mJ7ZXDdj8VwalMRPy_Cc-TSL8PhKyzpPgJ94Tusg-zWicRre5AugPkdtmhozH_u-_1lgI1R_x9m0cF33SA9_TNs8_rYF_ie2hifD6Clpic2yQGx6S1LTp8PZ2xXd2vMSd7DKuIZ0-8d.png"/>
+                    <pic:cNvPicPr/>
+                  </pic:nvPicPr>
+                  <pic:blipFill>
+                    <a:blip r:embed="rId4" cstate="print">
+                      <a:extLst>
+                        <a:ext uri="{28A0092B-C50C-407E-A947-70E740481C1C}">
+                          <a14:useLocalDpi xmlns:a14="http://schemas.microsoft.com/office/drawing/2010/main" val="0"/>
+                        </a:ext>
+                      </a:extLst>
+                    </a:blip>
+                    <a:stretch>
+                      <a:fillRect/>
+                    </a:stretch>
+                  </pic:blipFill>
+                  <pic:spPr>
+                    <a:xfrm>
+                      <a:off x="0" y="0"/>
+                      <a:ext cx="6690226" cy="1937735"/>
+                    </a:xfrm>
+                    <a:prstGeom prst="rect">
+                      <a:avLst/>
+                    </a:prstGeom>
+                  </pic:spPr>
+                </pic:pic>
+              </a:graphicData>
+            </a:graphic>
+          </wp:inline>
+        </w:drawing>
+      </w:r>
+    </w:p>
+    <w:p/>
     <w:sectPr>
       <w:pgSz w:w="12240" w:h="15840"/>
       <w:pgMar w:top="1440" w:right="1440" w:bottom="1440" w:left="1440" w:header="720" w:footer="720" w:gutter="0"/>

</xml_diff>

<commit_message>
update minh chung bai2 bai3
</commit_message>
<xml_diff>
--- a/Lab3/MinhChungLab03.docx
+++ b/Lab3/MinhChungLab03.docx
@@ -26,8 +26,6 @@
       <w:r>
         <w:t>Mô tả bài 1: Hệ thống quản lí đơn hàng có trạng thái như: Mới tạo, Đang xử lí, Đã giao và Đã hủy</w:t>
       </w:r>
-      <w:bookmarkStart w:id="0" w:name="_GoBack"/>
-      <w:bookmarkEnd w:id="0"/>
     </w:p>
     <w:p/>
     <w:p>
@@ -37,9 +35,9 @@
         </w:rPr>
         <w:drawing>
           <wp:inline distT="0" distB="0" distL="0" distR="0">
-            <wp:extent cx="6675862" cy="1933575"/>
+            <wp:extent cx="5943600" cy="2197100"/>
             <wp:effectExtent l="0" t="0" r="0" b="0"/>
-            <wp:docPr id="1" name="Picture 1"/>
+            <wp:docPr id="3" name="Picture 3"/>
             <wp:cNvGraphicFramePr>
               <a:graphicFrameLocks xmlns:a="http://schemas.openxmlformats.org/drawingml/2006/main" noChangeAspect="1"/>
             </wp:cNvGraphicFramePr>
@@ -47,11 +45,11 @@
               <a:graphicData uri="http://schemas.openxmlformats.org/drawingml/2006/picture">
                 <pic:pic xmlns:pic="http://schemas.openxmlformats.org/drawingml/2006/picture">
                   <pic:nvPicPr>
-                    <pic:cNvPr id="1" name="ZLJ1RXCn4BtxAqQzaAhQVa15KKCImG6QakI2nCKuarsh6-_Mwss3e6VEFNA2Y7D_e16d8FvZ_mJ7ZXDdj8VwalMRPy_Cc-TSL8PhKyzpPgJ94Tusg-zWicRre5AugPkdtmhozH_u-_1lgI1R_x9m0cF33SA9_TNs8_rYF_ie2hifD6Clpic2yQGx6S1LTp8PZ2xXd2vMSd7DKuIZ0-8d.png"/>
+                    <pic:cNvPr id="3" name="ZLJ1RXCn4BtxAqQzaAhQVa15KKCImG6QakI2nCKuarsh6-_Mwss3e6VEFNA2Y7D_e16d8FvZ_mJ7ZXDdj8VwalMRPy_Cc-TSL8PhKyzpPgJ94Tusg-zWicRre5AugPkdtmhozH_u-_1lgI1R_x9m0cF33SA9_TNs8_rYF_ie2hifD6Clpic2yQGx6S1LTp8PZ2xXd2vMSd7DKuIZ0-8d.png"/>
                     <pic:cNvPicPr/>
                   </pic:nvPicPr>
                   <pic:blipFill>
-                    <a:blip r:embed="rId4" cstate="print">
+                    <a:blip r:embed="rId4">
                       <a:extLst>
                         <a:ext uri="{28A0092B-C50C-407E-A947-70E740481C1C}">
                           <a14:useLocalDpi xmlns:a14="http://schemas.microsoft.com/office/drawing/2010/main" val="0"/>
@@ -65,7 +63,7 @@
                   <pic:spPr>
                     <a:xfrm>
                       <a:off x="0" y="0"/>
-                      <a:ext cx="6690226" cy="1937735"/>
+                      <a:ext cx="5943600" cy="2197100"/>
                     </a:xfrm>
                     <a:prstGeom prst="rect">
                       <a:avLst/>
@@ -78,7 +76,123 @@
         </w:drawing>
       </w:r>
     </w:p>
-    <w:p/>
+    <w:p>
+      <w:r>
+        <w:t>Mô tả bài 2: Tính toán thuế sản phẩm</w:t>
+      </w:r>
+    </w:p>
+    <w:p>
+      <w:r>
+        <w:rPr>
+          <w:noProof/>
+        </w:rPr>
+        <w:drawing>
+          <wp:inline distT="0" distB="0" distL="0" distR="0">
+            <wp:extent cx="5943600" cy="1849755"/>
+            <wp:effectExtent l="0" t="0" r="0" b="0"/>
+            <wp:docPr id="5" name="Picture 5"/>
+            <wp:cNvGraphicFramePr>
+              <a:graphicFrameLocks xmlns:a="http://schemas.openxmlformats.org/drawingml/2006/main" noChangeAspect="1"/>
+            </wp:cNvGraphicFramePr>
+            <a:graphic xmlns:a="http://schemas.openxmlformats.org/drawingml/2006/main">
+              <a:graphicData uri="http://schemas.openxmlformats.org/drawingml/2006/picture">
+                <pic:pic xmlns:pic="http://schemas.openxmlformats.org/drawingml/2006/picture">
+                  <pic:nvPicPr>
+                    <pic:cNvPr id="5" name="fLD1JiCm4Bpd5JuMeVG12A4YzOWGKYhkMtif5euTEJQqWlwTTGZjMbjEv9QPySpEobwD2MBAlMi6q6-mGzK7WqvzDee-xM0SrLCC9kiqO-LhbOSUrOtgKhH-n_0XMbq84_BM8ICe9nLYDklezqnVAmrEPqVO1lQBgzhWs1oRqtXZYgJQ7UPfh4yONu0owM37EEcyg6SJ8Qpny_s6x1Zm.png"/>
+                    <pic:cNvPicPr/>
+                  </pic:nvPicPr>
+                  <pic:blipFill>
+                    <a:blip r:embed="rId5">
+                      <a:extLst>
+                        <a:ext uri="{28A0092B-C50C-407E-A947-70E740481C1C}">
+                          <a14:useLocalDpi xmlns:a14="http://schemas.microsoft.com/office/drawing/2010/main" val="0"/>
+                        </a:ext>
+                      </a:extLst>
+                    </a:blip>
+                    <a:stretch>
+                      <a:fillRect/>
+                    </a:stretch>
+                  </pic:blipFill>
+                  <pic:spPr>
+                    <a:xfrm>
+                      <a:off x="0" y="0"/>
+                      <a:ext cx="5943600" cy="1849755"/>
+                    </a:xfrm>
+                    <a:prstGeom prst="rect">
+                      <a:avLst/>
+                    </a:prstGeom>
+                  </pic:spPr>
+                </pic:pic>
+              </a:graphicData>
+            </a:graphic>
+          </wp:inline>
+        </w:drawing>
+      </w:r>
+    </w:p>
+    <w:p>
+      <w:pPr>
+        <w:rPr>
+          <w:noProof/>
+        </w:rPr>
+      </w:pPr>
+      <w:r>
+        <w:rPr>
+          <w:noProof/>
+        </w:rPr>
+        <w:t>Mô tả bài 3:</w:t>
+      </w:r>
+      <w:bookmarkStart w:id="0" w:name="_GoBack"/>
+      <w:bookmarkEnd w:id="0"/>
+    </w:p>
+    <w:p>
+      <w:r>
+        <w:rPr>
+          <w:noProof/>
+        </w:rPr>
+        <w:lastRenderedPageBreak/>
+        <w:drawing>
+          <wp:inline distT="0" distB="0" distL="0" distR="0">
+            <wp:extent cx="5943600" cy="2651760"/>
+            <wp:effectExtent l="0" t="0" r="0" b="0"/>
+            <wp:docPr id="4" name="Picture 4"/>
+            <wp:cNvGraphicFramePr>
+              <a:graphicFrameLocks xmlns:a="http://schemas.openxmlformats.org/drawingml/2006/main" noChangeAspect="1"/>
+            </wp:cNvGraphicFramePr>
+            <a:graphic xmlns:a="http://schemas.openxmlformats.org/drawingml/2006/main">
+              <a:graphicData uri="http://schemas.openxmlformats.org/drawingml/2006/picture">
+                <pic:pic xmlns:pic="http://schemas.openxmlformats.org/drawingml/2006/picture">
+                  <pic:nvPicPr>
+                    <pic:cNvPr id="4" name="VLDHRkem4FpFAVmPz9GS03rLI45y8_K4YxsbKHtRiXsrY7Bt9c5ZRJ0XFqWpw_7CiDw523xsdIuSo2yuenY0YE9QYE5hJKJ_0HB54IuTclW-a_Jz-mIZD9P4DzP4_8cRYRyLqu_K488ueb6jEK_d6TpOpccCg1w90xHwHYTuOU3_Rrtdalb8BfyFBQww5Qm7Fo3doseLnFCs75nAw6nl.png"/>
+                    <pic:cNvPicPr/>
+                  </pic:nvPicPr>
+                  <pic:blipFill>
+                    <a:blip r:embed="rId6">
+                      <a:extLst>
+                        <a:ext uri="{28A0092B-C50C-407E-A947-70E740481C1C}">
+                          <a14:useLocalDpi xmlns:a14="http://schemas.microsoft.com/office/drawing/2010/main" val="0"/>
+                        </a:ext>
+                      </a:extLst>
+                    </a:blip>
+                    <a:stretch>
+                      <a:fillRect/>
+                    </a:stretch>
+                  </pic:blipFill>
+                  <pic:spPr>
+                    <a:xfrm>
+                      <a:off x="0" y="0"/>
+                      <a:ext cx="5943600" cy="2651760"/>
+                    </a:xfrm>
+                    <a:prstGeom prst="rect">
+                      <a:avLst/>
+                    </a:prstGeom>
+                  </pic:spPr>
+                </pic:pic>
+              </a:graphicData>
+            </a:graphic>
+          </wp:inline>
+        </w:drawing>
+      </w:r>
+    </w:p>
     <w:sectPr>
       <w:pgSz w:w="12240" w:h="15840"/>
       <w:pgMar w:top="1440" w:right="1440" w:bottom="1440" w:left="1440" w:header="720" w:footer="720" w:gutter="0"/>

</xml_diff>